<commit_message>
Released BR Class 333: guard buzzer on round button, Northern logo integrated in manual
Co-Authored-By: Claude Fable 5.1 <noreply@anthropic.com>

Claude-Session: https://claude.ai/code/session_018g4KeLEniBKRf6nuJD1TEU
</commit_message>
<xml_diff>
--- a/profiles/documentation/tsw-class-333-dtg-thejag.docx
+++ b/profiles/documentation/tsw-class-333-dtg-thejag.docx
@@ -89,7 +89,7 @@
               </w:rPr>
               <w:drawing>
                 <wp:inline distT="0" distB="0" distL="0" distR="0" wp14:anchorId="276B2983" wp14:editId="66AF2C29">
-                  <wp:extent cx="1000000" cy="306000"/>
+                  <wp:extent cx="1000000" cy="297000"/>
                   <wp:effectExtent l="0" t="0" r="0" b="0"/>
                   <wp:docPr id="579165032" name="Picture 3"/>
                   <wp:cNvGraphicFramePr>
@@ -120,7 +120,7 @@
                         <pic:spPr bwMode="auto">
                           <a:xfrm>
                             <a:off x="0" y="0"/>
-                            <a:ext cx="1000000" cy="306000"/>
+                            <a:ext cx="1000000" cy="297000"/>
                           </a:xfrm>
                           <a:prstGeom prst="rect">
                             <a:avLst/>
@@ -1341,12 +1341,12 @@
                     <wp:anchor distT="0" distB="0" distL="114300" distR="114300" simplePos="0" relativeHeight="251685888" behindDoc="0" locked="0" layoutInCell="1" allowOverlap="1" wp14:anchorId="2CBDD507" wp14:editId="27DA3422">
                       <wp:simplePos x="0" y="0"/>
                       <wp:positionH relativeFrom="column">
-                        <wp:posOffset>4026814</wp:posOffset>
+                        <wp:posOffset>3838915</wp:posOffset>
                       </wp:positionH>
                       <wp:positionV relativeFrom="paragraph">
                         <wp:posOffset>3649345</wp:posOffset>
                       </wp:positionV>
-                      <wp:extent cx="692101" cy="215900"/>
+                      <wp:extent cx="880000" cy="215900"/>
                       <wp:effectExtent l="0" t="0" r="13335" b="12700"/>
                       <wp:wrapNone/>
                       <wp:docPr id="1377470921" name="Rectangle 1"/>
@@ -1358,7 +1358,7 @@
                             <wps:spPr>
                               <a:xfrm>
                                 <a:off x="0" y="0"/>
-                                <a:ext cx="692101" cy="215900"/>
+                                <a:ext cx="880000" cy="215900"/>
                               </a:xfrm>
                               <a:prstGeom prst="rect">
                                 <a:avLst/>
@@ -1422,22 +1422,7 @@
                                         </w14:srgbClr>
                                       </w14:shadow>
                                     </w:rPr>
-                                    <w:t>Cab</w:t>
-                                  </w:r>
-                                  <w:r>
-                                    <w:rPr>
-                                      <w:b/>
-                                      <w:bCs/>
-                                      <w:color w:val="FF0000"/>
-                                      <w:sz w:val="20"/>
-                                      <w:szCs w:val="20"/>
-                                      <w14:shadow w14:blurRad="50800" w14:dist="38100" w14:dir="2700000" w14:sx="100000" w14:sy="100000" w14:kx="0" w14:ky="0" w14:algn="tl">
-                                        <w14:srgbClr w14:val="000000">
-                                          <w14:alpha w14:val="60000"/>
-                                        </w14:srgbClr>
-                                      </w14:shadow>
-                                    </w:rPr>
-                                    <w:t xml:space="preserve"> lights</w:t>
+                                    <w:t xml:space="preserve">Guard buzzer</w:t>
                                   </w:r>
                                 </w:p>
                               </w:txbxContent>

</xml_diff>